<commit_message>
formal: split the collision rule into its own theory, record machine-check outcomes, release notes for 3.2.0
22 of 25 lemmas verify with Tamarin 1.12.0 (12 handshake, 9 asynchronous
initiation including post-quantum forward secrecy with one-time prekeys,
1 collision trace); the three collision consistency lemmas are undecided
within a five-minute budget and tagged long. RESULTS.md documents the
environment, command lines, timings, the model fixes and the replay
finding. README, SECURITY.md, the paper and the changelog state the
outcomes precisely.

Co-Authored-By: Claude Fable 5.1 <noreply@anthropic.com>
</commit_message>
<xml_diff>
--- a/paper/NyxChat_Paper.docx
+++ b/paper/NyxChat_Paper.docx
@@ -172,7 +172,7 @@
         <w:spacing w:after="120"/>
       </w:pPr>
       <w:r>
-        <w:t>The contributions of this paper are: (i) the design of a transport-agnostic secure messaging layer with private discovery and sealed-sender delivery over untrusted relays, including a deterministic resolution of concurrent session initiation; (ii) a complete open-source implementation for Android, including a native BLE GATT server and a native ML-KEM-768 binding verified against NIST vectors; (iii) a multi-level evaluation: micro-benchmarks, wire overhead, mesh simulation with the production router, seeded fuzzing of every parser, end-to-end tests of complete stacks, and Tamarin models of the handshake; and (iv) a case study of the previous release of the same application, whose ratchet, handshake, post-quantum step and Bluetooth transport were all non-functional despite documentation to the contrary.</w:t>
+        <w:t>The contributions of this paper are: (i) the design of a transport-agnostic secure messaging layer with private discovery and sealed-sender delivery over untrusted relays, including a deterministic resolution of concurrent session initiation; (ii) a complete open-source implementation for Android, including a native BLE GATT server and a native ML-KEM-768 binding verified against NIST vectors; (iii) a multi-level evaluation: micro-benchmarks, wire overhead, mesh simulation with the production router, seeded fuzzing of every parser, end-to-end tests of complete stacks, and machine-checked Tamarin models of the handshake and of asynchronous initiation, which found protocol defects fixed before release; and (iv) a case study of the previous release of the same application, whose ratchet, handshake, post-quantum step and Bluetooth transport were all non-functional despite documentation to the contrary.</w:t>
       </w:r>
     </w:p>
     <w:p>
@@ -552,7 +552,16 @@
         <w:spacing w:after="120"/>
       </w:pPr>
       <w:r>
-        <w:t>A user may write to a contact who is not connected. The sender holds the contact's pinned IK and KPK, generates an ephemeral EK and computes dh1 = X25519(IK_A, IK_B), dh2 = X25519(EK_A, IK_B) and an ML-KEM encapsulation to KPK_B; the ratchet root is HKDF over 0xFF^32 || dh1 || dh2 || kem. The recipient's identity key doubles as its initial ratchet key and is replaced at its first reply. The ephemeral key and KEM ciphertext ride in every envelope until the sender has decrypted a reply. If both contacts initiate before either message arrives, the device with the lexicographically smaller handle ignores the incoming init and the other adopts the incoming session after decrypting its first message, then resends its queued messages. Two guards keep a late copy of the abandoned initiation from displacing the session that survived: the winner remembers every init it ignored, and the loser names its abandoned ephemeral on each message (authenticated as associated data of the AEAD, so relays can neither strip nor forge it) until the winner has demonstrably heard from it, so the winner blacklists it no later than the moment it stops waiting for a reply. The Tamarin model of the collision found both orderings before release. On a direct link, an undecryptable envelope triggers a rate-limited session-reset frame and both sides re-derive from the current handshake; messages not yet acknowledged as delivered are re-queued.</w:t>
+        <w:t xml:space="preserve">A user may write to a contact who is not connected. The sender holds the contact's pinned IK and, from their last meeting, a pool of one-time ML-KEM-768 prekeys the contact issued to it; it generates an ephemeral EK and computes dh1 = X25519(IK_A, IK_B), dh2 = X25519(EK_A, IK_B) and an ML-KEM encapsulation to one prekey OPK_B, whose 8-byte identifier travels in the init block; the ratchet root is HKDF over 0xFF^32 || dh1 || dh2 || kem with the identifier as salt and a label distinct from the fallback. Prekeys are the one-time keys of X3DH [1] transposed to the KEM as in PQXDH [4], distributed without a server: right after every direct handshake each side sends the other its current pool of eight public prekeys as a bundle signed with its identity key and stamped with an issue time, inside the link encryption; the receiver verifies it against the pinned key, refuses anything not newer than the bundle it holds, and replaces its pool, never re-admitting an identifier it already consumed. The recipient deletes a prekey's private half as soon as the first message under it has decrypted, so a session started through the mesh is forward secret from its first message, rather than from the first reply, against a later compromise of the recipient's device or long-term keys, a quantum adversary included (Tamarin lemma </w:t>
+      </w:r>
+      <w:r>
+        <w:rPr>
+          <w:rFonts w:ascii="Consolas" w:hAnsi="Consolas"/>
+        </w:rPr>
+        <w:t>async_pq_forward_secrecy</w:t>
+      </w:r>
+      <w:r>
+        <w:t>). When the sender holds no prekey, because the contacts never met, the pool is used up, or the recipient lost its store, the encapsulation targets the long-term KPK_B under the original label and the session is flagged as pending post-quantum forward secrecy until the next meeting; a recipient that no longer holds the named prekey answers with a notice signed by its identity key and bound to the offending ephemeral, on which the sender discards the stale pool, drops the pending session and re-sends under the long-term key. A prekey consumed by an initiation that loses a collision is simply gone on both sides. The recipient's identity key doubles as its initial ratchet key and is replaced at its first reply. The ephemeral key and KEM ciphertext ride in every envelope until the sender has decrypted a reply. If both contacts initiate before either message arrives, the device with the lexicographically smaller handle ignores the incoming init and the other adopts the incoming session after decrypting its first message, then resends its queued messages. Two guards keep a late copy of the abandoned initiation from displacing the session that survived: the winner remembers every init it ignored, and the loser names its abandoned ephemeral on each message (authenticated as associated data of the AEAD, so relays can neither strip nor forge it) until the winner has demonstrably heard from it, so the winner blacklists it no later than the moment it stops waiting for a reply. The Tamarin model of the collision found both orderings before release. On a direct link, an undecryptable envelope triggers a rate-limited session-reset frame and both sides re-derive from the current handshake; messages not yet acknowledged as delivered are re-queued.</w:t>
       </w:r>
     </w:p>
     <w:p>
@@ -742,7 +751,41 @@
         <w:pStyle w:val="Heading2"/>
       </w:pPr>
       <w:r>
-        <w:t>5.3 Sealed-sender store-and-forward</w:t>
+        <w:t>5.3 Wi-Fi Aware</w:t>
+      </w:r>
+    </w:p>
+    <w:p>
+      <w:pPr>
+        <w:spacing w:after="120"/>
+      </w:pPr>
+      <w:r>
+        <w:t xml:space="preserve">Android's Wi-Fi Aware (Neighbour Awareness Networking) lets two phones discover each other and open a link without an access point, at Wi-Fi rather than BLE data rates. NyxChat publishes the </w:t>
+      </w:r>
+      <w:r>
+        <w:rPr>
+          <w:rFonts w:ascii="Consolas" w:hAnsi="Consolas"/>
+        </w:rPr>
+        <w:t>nyxchat</w:t>
+      </w:r>
+      <w:r>
+        <w:t xml:space="preserve"> Aware service with the same rotating beacon as its BLE scan response as service-specific information, subscribes for it, and only requests a data path to a peer whose beacon resolves to a pinned contact or a public handle, so a passive observer learns exactly what BLE already reveals. The data path is a WPA2-protected IPv6 link-local network on which the publisher opens an ephemeral TCP port; the subscriber then runs the ordinary authenticated handshake of Section 4.3 over it, so Aware adds reach and bandwidth but no new trust assumptions. It needs Android 8 and the </w:t>
+      </w:r>
+      <w:r>
+        <w:rPr>
+          <w:rFonts w:ascii="Consolas" w:hAnsi="Consolas"/>
+        </w:rPr>
+        <w:t>wifi.aware</w:t>
+      </w:r>
+      <w:r>
+        <w:t xml:space="preserve"> hardware feature, which most phones sold since 2019 have; the implementation is exercised by unit tests against a fake platform channel and compiled for Android, but, like the BLE stack, it has not yet been measured on hardware in this work.</w:t>
+      </w:r>
+    </w:p>
+    <w:p>
+      <w:pPr>
+        <w:pStyle w:val="Heading2"/>
+      </w:pPr>
+      <w:r>
+        <w:t>5.4 Sealed-sender store-and-forward</w:t>
       </w:r>
     </w:p>
     <w:p>
@@ -758,7 +801,7 @@
         <w:pStyle w:val="Heading2"/>
       </w:pPr>
       <w:r>
-        <w:t>5.4 Internet relays</w:t>
+        <w:t>5.5 Internet relays</w:t>
       </w:r>
     </w:p>
     <w:p>
@@ -774,7 +817,7 @@
         <w:pStyle w:val="Heading2"/>
       </w:pPr>
       <w:r>
-        <w:t>5.5 Emergency channel</w:t>
+        <w:t>5.6 Emergency channel</w:t>
       </w:r>
     </w:p>
     <w:p>
@@ -790,7 +833,7 @@
         <w:pStyle w:val="Heading2"/>
       </w:pPr>
       <w:r>
-        <w:t>5.6 Delivery state machine</w:t>
+        <w:t>5.7 Delivery state machine</w:t>
       </w:r>
     </w:p>
     <w:p>
@@ -4525,10 +4568,10 @@
         <w:rPr>
           <w:i/>
         </w:rPr>
-        <w:t>Formal modelling:</w:t>
+        <w:t>Formal verification:</w:t>
       </w:r>
       <w:r>
-        <w:t xml:space="preserve"> Tamarin [28] models of the direct-link handshake and of the asynchronous initiation with its collision rule accompany the code with lemmas for executability, secrecy of the master secret, forward secrecy under long-term key reveal, injective mutual agreement, replay resistance, secrecy under a broken DH (KEM only) and under a broken KEM (DH only), and consistency of the adopted root under concurrent initiation; they have not yet been machine-checked in the repository and are provided for review. Writing them was nevertheless productive: the modeller identified that the responder's signature did not bind the initiator's identity (allowing an identity-misbinding trace without secrecy loss), that the responder had no replay cache for initiator nonces, and that a stale initiation block from a lost collision could displace a confirmed session; all three were fixed before release, and an ephemeral KEM key was added to the handshake for post-quantum forward secrecy.</w:t>
+        <w:t xml:space="preserve"> three Tamarin [28] theories accompany the code: the direct-link handshake (12 lemmas), asynchronous initiation with one-time prekeys (9 lemmas) and the concurrent-initiation collision rule (4 lemmas), stating executability, secrecy of the master secret, forward secrecy under long-term key reveal including the post-quantum variants, injective mutual agreement, replay resistance, secrecy under a broken DH (KEM only) and under a broken KEM (DH only), and consistency of the adopted root under concurrent initiation. All 12 handshake lemmas and all 9 initiation lemmas are machine-checked with Tamarin 1.12.0 (each in under two minutes, most in under twenty seconds); of the collision theory the executable trace is found and the three all-traces consistency lemmas remain undecided within a five-minute budget, with no counterexample found. Machine-checking found one further defect: only the most recently accepted initiation ephemeral was deduplicated, so a replayed copy of an older initiation could take the recovery path and rebuild a session the peer no longer held; every accepted ephemeral is now remembered. Writing the models had already been productive before the prover ran: the modeller identified that the responder's signature did not bind the initiator's identity (allowing an identity-misbinding trace without secrecy loss), that the responder had no replay cache for initiator nonces, and that a stale initiation block from a lost collision could displace a confirmed session; all three were fixed before release, and an ephemeral KEM key was added to the handshake for post-quantum forward secrecy.</w:t>
       </w:r>
     </w:p>
     <w:p>
@@ -4608,7 +4651,7 @@
         <w:spacing w:after="120"/>
       </w:pPr>
       <w:r>
-        <w:t>We argue informally for each goal of Section 3; a machine-checked model is future work.</w:t>
+        <w:t>We argue for each goal of Section 3, citing the machine-checked lemma where one exists (Section 5, formal verification); the collision rule's consistency lemmas are the only ones not yet decided by the prover.</w:t>
       </w:r>
     </w:p>
     <w:p>
@@ -4650,7 +4693,16 @@
         <w:t>Forward secrecy and post-compromise security.</w:t>
       </w:r>
       <w:r>
-        <w:t xml:space="preserve"> Every direct-link handshake contributes ephemeral values (dh2, dh3, dh4), so recorded sessions remain confidential after an identity-key compromise. Within a session the Double Ratchet deletes chain and message keys as it advances and heals after a compromise once the honest party performs a DH ratchet step [2, 3]. Asynchronous sessions are the weaker case: until the recipient replies, confidentiality against later compromise of the recipient's identity key rests on the sender's ephemeral key alone (dh2), exactly as in X3DH without one-time pre-keys; it is restored at the first reply.</w:t>
+        <w:t xml:space="preserve"> Every direct-link handshake contributes ephemeral values (dh2, dh3, dh4), so recorded sessions remain confidential after an identity-key compromise. Within a session the Double Ratchet deletes chain and message keys as it advances and heals after a compromise once the honest party performs a DH ratchet step [2, 3]. Asynchronous sessions started with a one-time prekey are no weaker: the recipient deletes the prekey's private half after the first decrypt, so the KEM secret, and with it the root, is forward secret from the first message (Tamarin lemma </w:t>
+      </w:r>
+      <w:r>
+        <w:rPr>
+          <w:rFonts w:ascii="Consolas" w:hAnsi="Consolas"/>
+        </w:rPr>
+        <w:t>async_pq_forward_secrecy</w:t>
+      </w:r>
+      <w:r>
+        <w:t>). Only the fallback without a prekey behaves as X3DH without one-time pre-keys: until the recipient replies, confidentiality against later compromise of the recipient's keys rests on the sender's ephemeral key alone (dh2), and post-quantum confidentiality on the long-term KEM key; both are restored at the first reply.</w:t>
       </w:r>
     </w:p>
     <w:p>
@@ -4759,7 +4811,7 @@
         <w:spacing w:after="120"/>
       </w:pPr>
       <w:r>
-        <w:t>The Bluetooth and Wi-Fi Direct transports have been exercised through the simulator and the integration tests and compile for Android, but this paper does not report measurements from a physical multi-device deployment; throughput, connection stability across Android vendors, and battery cost under continuous scanning, advertising and beacon rotation are the most important open questions and the subject of ongoing testing. Files over the mesh are capped at 4 MiB to protect relay storage. The simplified DHT lacks NAT traversal and Sybil resistance. Legacy handles from version 2 are still accepted and are derived from only 32 bits of key material; they remain safe only because trust rests on pinned keys, and they will be retired. Pair keys could be made forward-secret by deriving them from the ratchet root instead of the static agreement, at the cost of a bootstrapping problem for the first contact. Planned work includes an iOS peripheral, header encryption within the ratchet, machine-checking and extending the Tamarin models, an external audit, and a field study with volunteer users in a connectivity-constrained setting.</w:t>
+        <w:t>The Bluetooth and Wi-Fi Direct transports have been exercised through the simulator and the integration tests and compile for Android, but this paper does not report measurements from a physical multi-device deployment; throughput, connection stability across Android vendors, and battery cost under continuous scanning, advertising and beacon rotation are the most important open questions and the subject of ongoing testing. Files over the mesh are capped at 4 MiB to protect relay storage. The simplified DHT lacks NAT traversal and Sybil resistance. Legacy handles from version 2 are still accepted and are derived from only 32 bits of key material; they remain safe only because trust rests on pinned keys, and they will be retired. Pair keys could be made forward-secret by deriving them from the ratchet root instead of the static agreement, at the cost of a bootstrapping problem for the first contact. One-time prekeys exist only for contacts met on a direct link and are consumed one per initiation from a pool of eight topped up at every meeting, so contacts that rarely meet but often restart sessions fall back to the long-term key, which the contact screen shows; and because unused prekeys are part of encrypted backups, restoring one can resurrect a private half the live device had deleted, leaving that session only as confidential as the backup. Planned work includes an iOS peripheral, header encryption within the ratchet, deciding the three open collision lemmas and extending the Tamarin models to the ratchet and group layers, an external audit, and a field study with volunteer users in a connectivity-constrained setting.</w:t>
       </w:r>
     </w:p>
     <w:p>

</xml_diff>